<commit_message>
Add project report PDF
</commit_message>
<xml_diff>
--- a/OrbitDesk_AI_Support_Agent_Report.docx
+++ b/OrbitDesk_AI_Support_Agent_Report.docx
@@ -65,13 +65,6 @@
       </w:r>
     </w:p>
     <w:p>
-      <w:pPr>
-        <w:rPr>
-          <w:rFonts w:ascii="Times New Roman" w:hAnsi="Times New Roman" w:cs="Times New Roman"/>
-          <w:sz w:val="32"/>
-          <w:szCs w:val="32"/>
-        </w:rPr>
-      </w:pPr>
       <w:proofErr w:type="spellStart"/>
       <w:r>
         <w:rPr>
@@ -110,6 +103,51 @@
           <w:szCs w:val="32"/>
         </w:rPr>
       </w:pPr>
+      <w:r>
+        <w:rPr>
+          <w:rFonts w:ascii="Times New Roman" w:hAnsi="Times New Roman" w:cs="Times New Roman"/>
+          <w:sz w:val="32"/>
+          <w:szCs w:val="32"/>
+        </w:rPr>
+        <w:t>Video link</w:t>
+      </w:r>
+      <w:r>
+        <w:rPr>
+          <w:rFonts w:ascii="Times New Roman" w:hAnsi="Times New Roman" w:cs="Times New Roman"/>
+          <w:sz w:val="32"/>
+          <w:szCs w:val="32"/>
+        </w:rPr>
+        <w:t xml:space="preserve">: </w:t>
+      </w:r>
+      <w:hyperlink r:id="rId9" w:history="1">
+        <w:r>
+          <w:rPr>
+            <w:rStyle w:val="Hyperlink"/>
+            <w:rFonts w:ascii="Times New Roman" w:hAnsi="Times New Roman" w:cs="Times New Roman"/>
+            <w:sz w:val="32"/>
+            <w:szCs w:val="32"/>
+          </w:rPr>
+          <w:t>https://drive.google.com/file/d/11ISA15G7pOJnnbTSp-5B5bBD1WjeXnTU/view?usp=drivesdk</w:t>
+        </w:r>
+      </w:hyperlink>
+    </w:p>
+    <w:p>
+      <w:pPr>
+        <w:rPr>
+          <w:rFonts w:ascii="Times New Roman" w:hAnsi="Times New Roman" w:cs="Times New Roman"/>
+          <w:sz w:val="32"/>
+          <w:szCs w:val="32"/>
+        </w:rPr>
+      </w:pPr>
+    </w:p>
+    <w:p>
+      <w:pPr>
+        <w:rPr>
+          <w:rFonts w:ascii="Times New Roman" w:hAnsi="Times New Roman" w:cs="Times New Roman"/>
+          <w:sz w:val="32"/>
+          <w:szCs w:val="32"/>
+        </w:rPr>
+      </w:pPr>
     </w:p>
     <w:p>
       <w:pPr>
@@ -200,51 +238,6 @@
         </w:rPr>
         <w:t xml:space="preserve"> AI Support Agent: A Retrieval-Augmented Generation (RAG) System for Intelligent Customer Support</w:t>
       </w:r>
-    </w:p>
-    <w:p>
-      <w:pPr>
-        <w:rPr>
-          <w:rFonts w:ascii="Times New Roman" w:hAnsi="Times New Roman" w:cs="Times New Roman"/>
-          <w:sz w:val="32"/>
-          <w:szCs w:val="32"/>
-        </w:rPr>
-      </w:pPr>
-    </w:p>
-    <w:p>
-      <w:pPr>
-        <w:rPr>
-          <w:rFonts w:ascii="Times New Roman" w:hAnsi="Times New Roman" w:cs="Times New Roman"/>
-          <w:sz w:val="32"/>
-          <w:szCs w:val="32"/>
-        </w:rPr>
-      </w:pPr>
-    </w:p>
-    <w:p>
-      <w:pPr>
-        <w:rPr>
-          <w:rFonts w:ascii="Times New Roman" w:hAnsi="Times New Roman" w:cs="Times New Roman"/>
-          <w:sz w:val="32"/>
-          <w:szCs w:val="32"/>
-        </w:rPr>
-      </w:pPr>
-    </w:p>
-    <w:p>
-      <w:pPr>
-        <w:rPr>
-          <w:rFonts w:ascii="Times New Roman" w:hAnsi="Times New Roman" w:cs="Times New Roman"/>
-          <w:sz w:val="32"/>
-          <w:szCs w:val="32"/>
-        </w:rPr>
-      </w:pPr>
-    </w:p>
-    <w:p>
-      <w:pPr>
-        <w:rPr>
-          <w:rFonts w:ascii="Times New Roman" w:hAnsi="Times New Roman" w:cs="Times New Roman"/>
-          <w:sz w:val="32"/>
-          <w:szCs w:val="32"/>
-        </w:rPr>
-      </w:pPr>
     </w:p>
     <w:p>
       <w:pPr>
@@ -338,6 +331,7 @@
           <w:sz w:val="32"/>
           <w:szCs w:val="32"/>
         </w:rPr>
+        <w:lastRenderedPageBreak/>
         <w:t>ABSTRACT</w:t>
       </w:r>
     </w:p>
@@ -470,8 +464,18 @@
           <w:sz w:val="32"/>
           <w:szCs w:val="32"/>
         </w:rPr>
-        <w:t xml:space="preserve">Artificial Intelligence has transformed the way organizations provide customer support. Traditional chatbot systems generally depend on predefined rules or keyword matching, which limits their ability to answer complex questions. Recent advancements in Large Language Models (LLMs) have improved conversational capabilities, but these </w:t>
-      </w:r>
+        <w:t>Artificial Intelligence has transformed the way organizations provide customer support. Traditional chatbot systems generally depend on predefined rules or keyword matching, which limits their ability to answer complex questions. Recent advancements in Large Language Models (LLMs) have improved conversational capabilities, but these models may generate responses that are inaccurate or unsupported by official documentation.</w:t>
+      </w:r>
+    </w:p>
+    <w:p>
+      <w:pPr>
+        <w:jc w:val="both"/>
+        <w:rPr>
+          <w:rFonts w:ascii="Times New Roman" w:hAnsi="Times New Roman" w:cs="Times New Roman"/>
+          <w:sz w:val="32"/>
+          <w:szCs w:val="32"/>
+        </w:rPr>
+      </w:pPr>
       <w:r>
         <w:rPr>
           <w:rFonts w:ascii="Times New Roman" w:hAnsi="Times New Roman" w:cs="Times New Roman"/>
@@ -479,24 +483,6 @@
           <w:szCs w:val="32"/>
         </w:rPr>
         <w:lastRenderedPageBreak/>
-        <w:t>models may generate responses that are inaccurate or unsupported by official documentation.</w:t>
-      </w:r>
-    </w:p>
-    <w:p>
-      <w:pPr>
-        <w:jc w:val="both"/>
-        <w:rPr>
-          <w:rFonts w:ascii="Times New Roman" w:hAnsi="Times New Roman" w:cs="Times New Roman"/>
-          <w:sz w:val="32"/>
-          <w:szCs w:val="32"/>
-        </w:rPr>
-      </w:pPr>
-      <w:r>
-        <w:rPr>
-          <w:rFonts w:ascii="Times New Roman" w:hAnsi="Times New Roman" w:cs="Times New Roman"/>
-          <w:sz w:val="32"/>
-          <w:szCs w:val="32"/>
-        </w:rPr>
         <w:t>To overcome this limitation, Retrieval-Augmented Generation (RAG) combines document retrieval with language generation. Instead of relying solely on the language model's knowledge, the system first retrieves relevant documents and then generates responses based only on the retrieved information.</w:t>
       </w:r>
     </w:p>
@@ -688,7 +674,6 @@
           <w:sz w:val="32"/>
           <w:szCs w:val="32"/>
         </w:rPr>
-        <w:lastRenderedPageBreak/>
         <w:t>The main objectives of this project are:</w:t>
       </w:r>
     </w:p>
@@ -711,6 +696,7 @@
           <w:sz w:val="32"/>
           <w:szCs w:val="32"/>
         </w:rPr>
+        <w:lastRenderedPageBreak/>
         <w:t xml:space="preserve">Develop an AI-powered support assistant for </w:t>
       </w:r>
       <w:proofErr w:type="spellStart"/>
@@ -1021,7 +1007,7 @@
                     </pic:cNvPicPr>
                   </pic:nvPicPr>
                   <pic:blipFill>
-                    <a:blip r:embed="rId9" cstate="print">
+                    <a:blip r:embed="rId10" cstate="print">
                       <a:extLst>
                         <a:ext uri="{28A0092B-C50C-407E-A947-70E740481C1C}">
                           <a14:useLocalDpi xmlns:a14="http://schemas.microsoft.com/office/drawing/2010/main" val="0"/>
@@ -2649,7 +2635,7 @@
           <w:szCs w:val="32"/>
         </w:rPr>
         <w:pict w14:anchorId="485215C1">
-          <v:rect id="_x0000_i1051" style="width:0;height:1.5pt" o:hralign="center" o:hrstd="t" o:hr="t" fillcolor="#a0a0a0" stroked="f"/>
+          <v:rect id="_x0000_i1025" style="width:0;height:1.5pt" o:hralign="center" o:hrstd="t" o:hr="t" fillcolor="#a0a0a0" stroked="f"/>
         </w:pict>
       </w:r>
     </w:p>
@@ -3324,6 +3310,7 @@
       <w:r>
         <w:rPr>
           <w:rFonts w:ascii="Times New Roman" w:hAnsi="Times New Roman" w:cs="Times New Roman"/>
+          <w:noProof/>
           <w:sz w:val="32"/>
           <w:szCs w:val="32"/>
         </w:rPr>
@@ -3344,7 +3331,7 @@
                     <pic:cNvPicPr/>
                   </pic:nvPicPr>
                   <pic:blipFill>
-                    <a:blip r:embed="rId10"/>
+                    <a:blip r:embed="rId11"/>
                     <a:stretch>
                       <a:fillRect/>
                     </a:stretch>
@@ -3367,6 +3354,7 @@
       <w:r>
         <w:rPr>
           <w:rFonts w:ascii="Times New Roman" w:hAnsi="Times New Roman" w:cs="Times New Roman"/>
+          <w:noProof/>
           <w:sz w:val="32"/>
           <w:szCs w:val="32"/>
         </w:rPr>
@@ -3386,7 +3374,7 @@
                     <pic:cNvPicPr/>
                   </pic:nvPicPr>
                   <pic:blipFill>
-                    <a:blip r:embed="rId11"/>
+                    <a:blip r:embed="rId12"/>
                     <a:stretch>
                       <a:fillRect/>
                     </a:stretch>
@@ -3526,6 +3514,7 @@
       <w:r>
         <w:rPr>
           <w:rFonts w:ascii="Times New Roman" w:hAnsi="Times New Roman" w:cs="Times New Roman"/>
+          <w:noProof/>
           <w:sz w:val="32"/>
           <w:szCs w:val="32"/>
         </w:rPr>
@@ -3545,7 +3534,7 @@
                     <pic:cNvPicPr/>
                   </pic:nvPicPr>
                   <pic:blipFill>
-                    <a:blip r:embed="rId12"/>
+                    <a:blip r:embed="rId13"/>
                     <a:stretch>
                       <a:fillRect/>
                     </a:stretch>
@@ -3568,6 +3557,7 @@
       <w:r>
         <w:rPr>
           <w:rFonts w:ascii="Times New Roman" w:hAnsi="Times New Roman" w:cs="Times New Roman"/>
+          <w:noProof/>
           <w:sz w:val="32"/>
           <w:szCs w:val="32"/>
         </w:rPr>
@@ -3587,7 +3577,7 @@
                     <pic:cNvPicPr/>
                   </pic:nvPicPr>
                   <pic:blipFill>
-                    <a:blip r:embed="rId13"/>
+                    <a:blip r:embed="rId14"/>
                     <a:stretch>
                       <a:fillRect/>
                     </a:stretch>
@@ -3673,6 +3663,7 @@
       <w:r>
         <w:rPr>
           <w:rFonts w:ascii="Times New Roman" w:hAnsi="Times New Roman" w:cs="Times New Roman"/>
+          <w:noProof/>
           <w:sz w:val="32"/>
           <w:szCs w:val="32"/>
         </w:rPr>
@@ -3693,7 +3684,7 @@
                     <pic:cNvPicPr/>
                   </pic:nvPicPr>
                   <pic:blipFill>
-                    <a:blip r:embed="rId14"/>
+                    <a:blip r:embed="rId15"/>
                     <a:stretch>
                       <a:fillRect/>
                     </a:stretch>
@@ -3716,6 +3707,7 @@
       <w:r>
         <w:rPr>
           <w:rFonts w:ascii="Times New Roman" w:hAnsi="Times New Roman" w:cs="Times New Roman"/>
+          <w:noProof/>
           <w:sz w:val="32"/>
           <w:szCs w:val="32"/>
         </w:rPr>
@@ -3735,7 +3727,7 @@
                     <pic:cNvPicPr/>
                   </pic:nvPicPr>
                   <pic:blipFill>
-                    <a:blip r:embed="rId15"/>
+                    <a:blip r:embed="rId16"/>
                     <a:stretch>
                       <a:fillRect/>
                     </a:stretch>
@@ -3866,6 +3858,7 @@
       <w:r>
         <w:rPr>
           <w:rFonts w:ascii="Times New Roman" w:hAnsi="Times New Roman" w:cs="Times New Roman"/>
+          <w:noProof/>
           <w:sz w:val="32"/>
           <w:szCs w:val="32"/>
         </w:rPr>
@@ -3885,7 +3878,7 @@
                     <pic:cNvPicPr/>
                   </pic:nvPicPr>
                   <pic:blipFill>
-                    <a:blip r:embed="rId16"/>
+                    <a:blip r:embed="rId17"/>
                     <a:stretch>
                       <a:fillRect/>
                     </a:stretch>
@@ -3980,6 +3973,7 @@
       <w:r>
         <w:rPr>
           <w:rFonts w:ascii="Times New Roman" w:hAnsi="Times New Roman" w:cs="Times New Roman"/>
+          <w:noProof/>
           <w:sz w:val="32"/>
           <w:szCs w:val="32"/>
         </w:rPr>
@@ -4000,7 +3994,7 @@
                     <pic:cNvPicPr/>
                   </pic:nvPicPr>
                   <pic:blipFill>
-                    <a:blip r:embed="rId17"/>
+                    <a:blip r:embed="rId18"/>
                     <a:stretch>
                       <a:fillRect/>
                     </a:stretch>
@@ -4068,6 +4062,7 @@
       <w:r>
         <w:rPr>
           <w:rFonts w:ascii="Times New Roman" w:hAnsi="Times New Roman" w:cs="Times New Roman"/>
+          <w:noProof/>
           <w:sz w:val="32"/>
           <w:szCs w:val="32"/>
         </w:rPr>
@@ -4087,7 +4082,7 @@
                     <pic:cNvPicPr/>
                   </pic:nvPicPr>
                   <pic:blipFill>
-                    <a:blip r:embed="rId18"/>
+                    <a:blip r:embed="rId19"/>
                     <a:stretch>
                       <a:fillRect/>
                     </a:stretch>
@@ -4152,21 +4147,14 @@
           <w:szCs w:val="32"/>
         </w:rPr>
       </w:pPr>
-    </w:p>
-    <w:p>
-      <w:pPr>
-        <w:rPr>
-          <w:rFonts w:ascii="Times New Roman" w:hAnsi="Times New Roman" w:cs="Times New Roman"/>
-          <w:sz w:val="32"/>
-          <w:szCs w:val="32"/>
-        </w:rPr>
-      </w:pPr>
-      <w:r>
-        <w:rPr>
-          <w:rFonts w:ascii="Times New Roman" w:hAnsi="Times New Roman" w:cs="Times New Roman"/>
-          <w:sz w:val="32"/>
-          <w:szCs w:val="32"/>
-        </w:rPr>
+      <w:r>
+        <w:rPr>
+          <w:rFonts w:ascii="Times New Roman" w:hAnsi="Times New Roman" w:cs="Times New Roman"/>
+          <w:noProof/>
+          <w:sz w:val="32"/>
+          <w:szCs w:val="32"/>
+        </w:rPr>
+        <w:lastRenderedPageBreak/>
         <w:drawing>
           <wp:inline distT="0" distB="0" distL="0" distR="0" wp14:anchorId="74771A9D" wp14:editId="6A51A649">
             <wp:extent cx="5731510" cy="2542540"/>
@@ -4183,7 +4171,7 @@
                     <pic:cNvPicPr/>
                   </pic:nvPicPr>
                   <pic:blipFill>
-                    <a:blip r:embed="rId19"/>
+                    <a:blip r:embed="rId20"/>
                     <a:stretch>
                       <a:fillRect/>
                     </a:stretch>
@@ -4273,9 +4261,348 @@
 <file path=word/numbering.xml><?xml version="1.0" encoding="utf-8"?>
 <w:numbering xmlns:wpc="http://schemas.microsoft.com/office/word/2010/wordprocessingCanvas" xmlns:cx="http://schemas.microsoft.com/office/drawing/2014/chartex" xmlns:cx1="http://schemas.microsoft.com/office/drawing/2015/9/8/chartex" xmlns:cx2="http://schemas.microsoft.com/office/drawing/2015/10/21/chartex" xmlns:cx3="http://schemas.microsoft.com/office/drawing/2016/5/9/chartex" xmlns:cx4="http://schemas.microsoft.com/office/drawing/2016/5/10/chartex" xmlns:cx5="http://schemas.microsoft.com/office/drawing/2016/5/11/chartex" xmlns:cx6="http://schemas.microsoft.com/office/drawing/2016/5/12/chartex" xmlns:cx7="http://schemas.microsoft.com/office/drawing/2016/5/13/chartex" xmlns:cx8="http://schemas.microsoft.com/office/drawing/2016/5/14/chartex" xmlns:mc="http://schemas.openxmlformats.org/markup-compatibility/2006" xmlns:aink="http://schemas.microsoft.com/office/drawing/2016/ink" xmlns:am3d="http://schemas.microsoft.com/office/drawing/2017/model3d" xmlns:o="urn:schemas-microsoft-com:office:office" xmlns:oel="http://schemas.microsoft.com/office/2019/extlst" xmlns:r="http://schemas.openxmlformats.org/officeDocument/2006/relationships" xmlns:m="http://schemas.openxmlformats.org/officeDocument/2006/math" xmlns:v="urn:schemas-microsoft-com:vml" xmlns:wp14="http://schemas.microsoft.com/office/word/2010/wordprocessingDrawing" xmlns:wp="http://schemas.openxmlformats.org/drawingml/2006/wordprocessingDrawing" xmlns:w10="urn:schemas-microsoft-com:office:word" xmlns:w="http://schemas.openxmlformats.org/wordprocessingml/2006/main" xmlns:w14="http://schemas.microsoft.com/office/word/2010/wordml" xmlns:w15="http://schemas.microsoft.com/office/word/2012/wordml" xmlns:w16cei="http://schemas.microsoft.com/office/word/2026/wordml/cei" xmlns:w16cex="http://schemas.microsoft.com/office/word/2018/wordml/cex" xmlns:w16cid="http://schemas.microsoft.com/office/word/2016/wordml/cid" xmlns:w16="http://schemas.microsoft.com/office/word/2018/wordml" xmlns:w16du="http://schemas.microsoft.com/office/word/2023/wordml/word16du" xmlns:w16sdtdh="http://schemas.microsoft.com/office/word/2020/wordml/sdtdatahash" xmlns:w16sdtfl="http://schemas.microsoft.com/office/word/2024/wordml/sdtformatlock" xmlns:w16se="http://schemas.microsoft.com/office/word/2015/wordml/symex" xmlns:wpg="http://schemas.microsoft.com/office/word/2010/wordprocessingGroup" xmlns:wpi="http://schemas.microsoft.com/office/word/2010/wordprocessingInk" xmlns:wne="http://schemas.microsoft.com/office/word/2006/wordml" xmlns:wps="http://schemas.microsoft.com/office/word/2010/wordprocessingShape" mc:Ignorable="w14 w15 w16se w16cid w16 w16cex w16sdtdh w16sdtfl w16du wp14">
   <w:abstractNum w:abstractNumId="0" w15:restartNumberingAfterBreak="0">
-    <w:nsid w:val="53E07D10"/>
+    <w:nsid w:val="07864A57"/>
     <w:multiLevelType w:val="multilevel"/>
-    <w:tmpl w:val="35BCE85C"/>
+    <w:tmpl w:val="452061BE"/>
+    <w:lvl w:ilvl="0">
+      <w:start w:val="3"/>
+      <w:numFmt w:val="decimal"/>
+      <w:lvlText w:val="%1."/>
+      <w:lvlJc w:val="left"/>
+      <w:pPr>
+        <w:tabs>
+          <w:tab w:val="num" w:pos="720"/>
+        </w:tabs>
+        <w:ind w:left="720" w:hanging="360"/>
+      </w:pPr>
+    </w:lvl>
+    <w:lvl w:ilvl="1" w:tentative="1">
+      <w:start w:val="1"/>
+      <w:numFmt w:val="decimal"/>
+      <w:lvlText w:val="%2."/>
+      <w:lvlJc w:val="left"/>
+      <w:pPr>
+        <w:tabs>
+          <w:tab w:val="num" w:pos="1440"/>
+        </w:tabs>
+        <w:ind w:left="1440" w:hanging="360"/>
+      </w:pPr>
+    </w:lvl>
+    <w:lvl w:ilvl="2" w:tentative="1">
+      <w:start w:val="1"/>
+      <w:numFmt w:val="decimal"/>
+      <w:lvlText w:val="%3."/>
+      <w:lvlJc w:val="left"/>
+      <w:pPr>
+        <w:tabs>
+          <w:tab w:val="num" w:pos="2160"/>
+        </w:tabs>
+        <w:ind w:left="2160" w:hanging="360"/>
+      </w:pPr>
+    </w:lvl>
+    <w:lvl w:ilvl="3" w:tentative="1">
+      <w:start w:val="1"/>
+      <w:numFmt w:val="decimal"/>
+      <w:lvlText w:val="%4."/>
+      <w:lvlJc w:val="left"/>
+      <w:pPr>
+        <w:tabs>
+          <w:tab w:val="num" w:pos="2880"/>
+        </w:tabs>
+        <w:ind w:left="2880" w:hanging="360"/>
+      </w:pPr>
+    </w:lvl>
+    <w:lvl w:ilvl="4" w:tentative="1">
+      <w:start w:val="1"/>
+      <w:numFmt w:val="decimal"/>
+      <w:lvlText w:val="%5."/>
+      <w:lvlJc w:val="left"/>
+      <w:pPr>
+        <w:tabs>
+          <w:tab w:val="num" w:pos="3600"/>
+        </w:tabs>
+        <w:ind w:left="3600" w:hanging="360"/>
+      </w:pPr>
+    </w:lvl>
+    <w:lvl w:ilvl="5" w:tentative="1">
+      <w:start w:val="1"/>
+      <w:numFmt w:val="decimal"/>
+      <w:lvlText w:val="%6."/>
+      <w:lvlJc w:val="left"/>
+      <w:pPr>
+        <w:tabs>
+          <w:tab w:val="num" w:pos="4320"/>
+        </w:tabs>
+        <w:ind w:left="4320" w:hanging="360"/>
+      </w:pPr>
+    </w:lvl>
+    <w:lvl w:ilvl="6" w:tentative="1">
+      <w:start w:val="1"/>
+      <w:numFmt w:val="decimal"/>
+      <w:lvlText w:val="%7."/>
+      <w:lvlJc w:val="left"/>
+      <w:pPr>
+        <w:tabs>
+          <w:tab w:val="num" w:pos="5040"/>
+        </w:tabs>
+        <w:ind w:left="5040" w:hanging="360"/>
+      </w:pPr>
+    </w:lvl>
+    <w:lvl w:ilvl="7" w:tentative="1">
+      <w:start w:val="1"/>
+      <w:numFmt w:val="decimal"/>
+      <w:lvlText w:val="%8."/>
+      <w:lvlJc w:val="left"/>
+      <w:pPr>
+        <w:tabs>
+          <w:tab w:val="num" w:pos="5760"/>
+        </w:tabs>
+        <w:ind w:left="5760" w:hanging="360"/>
+      </w:pPr>
+    </w:lvl>
+    <w:lvl w:ilvl="8" w:tentative="1">
+      <w:start w:val="1"/>
+      <w:numFmt w:val="decimal"/>
+      <w:lvlText w:val="%9."/>
+      <w:lvlJc w:val="left"/>
+      <w:pPr>
+        <w:tabs>
+          <w:tab w:val="num" w:pos="6480"/>
+        </w:tabs>
+        <w:ind w:left="6480" w:hanging="360"/>
+      </w:pPr>
+    </w:lvl>
+  </w:abstractNum>
+  <w:abstractNum w:abstractNumId="1" w15:restartNumberingAfterBreak="0">
+    <w:nsid w:val="38B12C9F"/>
+    <w:multiLevelType w:val="multilevel"/>
+    <w:tmpl w:val="FE1CFC06"/>
+    <w:lvl w:ilvl="0">
+      <w:start w:val="1"/>
+      <w:numFmt w:val="decimal"/>
+      <w:lvlText w:val="%1."/>
+      <w:lvlJc w:val="left"/>
+      <w:pPr>
+        <w:tabs>
+          <w:tab w:val="num" w:pos="720"/>
+        </w:tabs>
+        <w:ind w:left="720" w:hanging="360"/>
+      </w:pPr>
+    </w:lvl>
+    <w:lvl w:ilvl="1" w:tentative="1">
+      <w:start w:val="1"/>
+      <w:numFmt w:val="decimal"/>
+      <w:lvlText w:val="%2."/>
+      <w:lvlJc w:val="left"/>
+      <w:pPr>
+        <w:tabs>
+          <w:tab w:val="num" w:pos="1440"/>
+        </w:tabs>
+        <w:ind w:left="1440" w:hanging="360"/>
+      </w:pPr>
+    </w:lvl>
+    <w:lvl w:ilvl="2" w:tentative="1">
+      <w:start w:val="1"/>
+      <w:numFmt w:val="decimal"/>
+      <w:lvlText w:val="%3."/>
+      <w:lvlJc w:val="left"/>
+      <w:pPr>
+        <w:tabs>
+          <w:tab w:val="num" w:pos="2160"/>
+        </w:tabs>
+        <w:ind w:left="2160" w:hanging="360"/>
+      </w:pPr>
+    </w:lvl>
+    <w:lvl w:ilvl="3" w:tentative="1">
+      <w:start w:val="1"/>
+      <w:numFmt w:val="decimal"/>
+      <w:lvlText w:val="%4."/>
+      <w:lvlJc w:val="left"/>
+      <w:pPr>
+        <w:tabs>
+          <w:tab w:val="num" w:pos="2880"/>
+        </w:tabs>
+        <w:ind w:left="2880" w:hanging="360"/>
+      </w:pPr>
+    </w:lvl>
+    <w:lvl w:ilvl="4" w:tentative="1">
+      <w:start w:val="1"/>
+      <w:numFmt w:val="decimal"/>
+      <w:lvlText w:val="%5."/>
+      <w:lvlJc w:val="left"/>
+      <w:pPr>
+        <w:tabs>
+          <w:tab w:val="num" w:pos="3600"/>
+        </w:tabs>
+        <w:ind w:left="3600" w:hanging="360"/>
+      </w:pPr>
+    </w:lvl>
+    <w:lvl w:ilvl="5" w:tentative="1">
+      <w:start w:val="1"/>
+      <w:numFmt w:val="decimal"/>
+      <w:lvlText w:val="%6."/>
+      <w:lvlJc w:val="left"/>
+      <w:pPr>
+        <w:tabs>
+          <w:tab w:val="num" w:pos="4320"/>
+        </w:tabs>
+        <w:ind w:left="4320" w:hanging="360"/>
+      </w:pPr>
+    </w:lvl>
+    <w:lvl w:ilvl="6" w:tentative="1">
+      <w:start w:val="1"/>
+      <w:numFmt w:val="decimal"/>
+      <w:lvlText w:val="%7."/>
+      <w:lvlJc w:val="left"/>
+      <w:pPr>
+        <w:tabs>
+          <w:tab w:val="num" w:pos="5040"/>
+        </w:tabs>
+        <w:ind w:left="5040" w:hanging="360"/>
+      </w:pPr>
+    </w:lvl>
+    <w:lvl w:ilvl="7" w:tentative="1">
+      <w:start w:val="1"/>
+      <w:numFmt w:val="decimal"/>
+      <w:lvlText w:val="%8."/>
+      <w:lvlJc w:val="left"/>
+      <w:pPr>
+        <w:tabs>
+          <w:tab w:val="num" w:pos="5760"/>
+        </w:tabs>
+        <w:ind w:left="5760" w:hanging="360"/>
+      </w:pPr>
+    </w:lvl>
+    <w:lvl w:ilvl="8" w:tentative="1">
+      <w:start w:val="1"/>
+      <w:numFmt w:val="decimal"/>
+      <w:lvlText w:val="%9."/>
+      <w:lvlJc w:val="left"/>
+      <w:pPr>
+        <w:tabs>
+          <w:tab w:val="num" w:pos="6480"/>
+        </w:tabs>
+        <w:ind w:left="6480" w:hanging="360"/>
+      </w:pPr>
+    </w:lvl>
+  </w:abstractNum>
+  <w:abstractNum w:abstractNumId="2" w15:restartNumberingAfterBreak="0">
+    <w:nsid w:val="44151B94"/>
+    <w:multiLevelType w:val="multilevel"/>
+    <w:tmpl w:val="7AA465A4"/>
+    <w:lvl w:ilvl="0">
+      <w:start w:val="2"/>
+      <w:numFmt w:val="decimal"/>
+      <w:lvlText w:val="%1."/>
+      <w:lvlJc w:val="left"/>
+      <w:pPr>
+        <w:tabs>
+          <w:tab w:val="num" w:pos="720"/>
+        </w:tabs>
+        <w:ind w:left="720" w:hanging="360"/>
+      </w:pPr>
+    </w:lvl>
+    <w:lvl w:ilvl="1" w:tentative="1">
+      <w:start w:val="1"/>
+      <w:numFmt w:val="decimal"/>
+      <w:lvlText w:val="%2."/>
+      <w:lvlJc w:val="left"/>
+      <w:pPr>
+        <w:tabs>
+          <w:tab w:val="num" w:pos="1440"/>
+        </w:tabs>
+        <w:ind w:left="1440" w:hanging="360"/>
+      </w:pPr>
+    </w:lvl>
+    <w:lvl w:ilvl="2" w:tentative="1">
+      <w:start w:val="1"/>
+      <w:numFmt w:val="decimal"/>
+      <w:lvlText w:val="%3."/>
+      <w:lvlJc w:val="left"/>
+      <w:pPr>
+        <w:tabs>
+          <w:tab w:val="num" w:pos="2160"/>
+        </w:tabs>
+        <w:ind w:left="2160" w:hanging="360"/>
+      </w:pPr>
+    </w:lvl>
+    <w:lvl w:ilvl="3" w:tentative="1">
+      <w:start w:val="1"/>
+      <w:numFmt w:val="decimal"/>
+      <w:lvlText w:val="%4."/>
+      <w:lvlJc w:val="left"/>
+      <w:pPr>
+        <w:tabs>
+          <w:tab w:val="num" w:pos="2880"/>
+        </w:tabs>
+        <w:ind w:left="2880" w:hanging="360"/>
+      </w:pPr>
+    </w:lvl>
+    <w:lvl w:ilvl="4" w:tentative="1">
+      <w:start w:val="1"/>
+      <w:numFmt w:val="decimal"/>
+      <w:lvlText w:val="%5."/>
+      <w:lvlJc w:val="left"/>
+      <w:pPr>
+        <w:tabs>
+          <w:tab w:val="num" w:pos="3600"/>
+        </w:tabs>
+        <w:ind w:left="3600" w:hanging="360"/>
+      </w:pPr>
+    </w:lvl>
+    <w:lvl w:ilvl="5" w:tentative="1">
+      <w:start w:val="1"/>
+      <w:numFmt w:val="decimal"/>
+      <w:lvlText w:val="%6."/>
+      <w:lvlJc w:val="left"/>
+      <w:pPr>
+        <w:tabs>
+          <w:tab w:val="num" w:pos="4320"/>
+        </w:tabs>
+        <w:ind w:left="4320" w:hanging="360"/>
+      </w:pPr>
+    </w:lvl>
+    <w:lvl w:ilvl="6" w:tentative="1">
+      <w:start w:val="1"/>
+      <w:numFmt w:val="decimal"/>
+      <w:lvlText w:val="%7."/>
+      <w:lvlJc w:val="left"/>
+      <w:pPr>
+        <w:tabs>
+          <w:tab w:val="num" w:pos="5040"/>
+        </w:tabs>
+        <w:ind w:left="5040" w:hanging="360"/>
+      </w:pPr>
+    </w:lvl>
+    <w:lvl w:ilvl="7" w:tentative="1">
+      <w:start w:val="1"/>
+      <w:numFmt w:val="decimal"/>
+      <w:lvlText w:val="%8."/>
+      <w:lvlJc w:val="left"/>
+      <w:pPr>
+        <w:tabs>
+          <w:tab w:val="num" w:pos="5760"/>
+        </w:tabs>
+        <w:ind w:left="5760" w:hanging="360"/>
+      </w:pPr>
+    </w:lvl>
+    <w:lvl w:ilvl="8" w:tentative="1">
+      <w:start w:val="1"/>
+      <w:numFmt w:val="decimal"/>
+      <w:lvlText w:val="%9."/>
+      <w:lvlJc w:val="left"/>
+      <w:pPr>
+        <w:tabs>
+          <w:tab w:val="num" w:pos="6480"/>
+        </w:tabs>
+        <w:ind w:left="6480" w:hanging="360"/>
+      </w:pPr>
+    </w:lvl>
+  </w:abstractNum>
+  <w:abstractNum w:abstractNumId="3" w15:restartNumberingAfterBreak="0">
+    <w:nsid w:val="4DEF2242"/>
+    <w:multiLevelType w:val="multilevel"/>
+    <w:tmpl w:val="0BAC2646"/>
     <w:lvl w:ilvl="0">
       <w:start w:val="1"/>
       <w:numFmt w:val="bullet"/>
@@ -4421,8 +4748,285 @@
       </w:rPr>
     </w:lvl>
   </w:abstractNum>
+  <w:abstractNum w:abstractNumId="4" w15:restartNumberingAfterBreak="0">
+    <w:nsid w:val="53E07D10"/>
+    <w:multiLevelType w:val="multilevel"/>
+    <w:tmpl w:val="35BCE85C"/>
+    <w:lvl w:ilvl="0">
+      <w:start w:val="1"/>
+      <w:numFmt w:val="bullet"/>
+      <w:lvlText w:val=""/>
+      <w:lvlJc w:val="left"/>
+      <w:pPr>
+        <w:tabs>
+          <w:tab w:val="num" w:pos="720"/>
+        </w:tabs>
+        <w:ind w:left="720" w:hanging="360"/>
+      </w:pPr>
+      <w:rPr>
+        <w:rFonts w:ascii="Symbol" w:hAnsi="Symbol" w:hint="default"/>
+        <w:sz w:val="20"/>
+      </w:rPr>
+    </w:lvl>
+    <w:lvl w:ilvl="1" w:tentative="1">
+      <w:start w:val="1"/>
+      <w:numFmt w:val="bullet"/>
+      <w:lvlText w:val="o"/>
+      <w:lvlJc w:val="left"/>
+      <w:pPr>
+        <w:tabs>
+          <w:tab w:val="num" w:pos="1440"/>
+        </w:tabs>
+        <w:ind w:left="1440" w:hanging="360"/>
+      </w:pPr>
+      <w:rPr>
+        <w:rFonts w:ascii="Courier New" w:hAnsi="Courier New" w:hint="default"/>
+        <w:sz w:val="20"/>
+      </w:rPr>
+    </w:lvl>
+    <w:lvl w:ilvl="2" w:tentative="1">
+      <w:start w:val="1"/>
+      <w:numFmt w:val="bullet"/>
+      <w:lvlText w:val=""/>
+      <w:lvlJc w:val="left"/>
+      <w:pPr>
+        <w:tabs>
+          <w:tab w:val="num" w:pos="2160"/>
+        </w:tabs>
+        <w:ind w:left="2160" w:hanging="360"/>
+      </w:pPr>
+      <w:rPr>
+        <w:rFonts w:ascii="Wingdings" w:hAnsi="Wingdings" w:hint="default"/>
+        <w:sz w:val="20"/>
+      </w:rPr>
+    </w:lvl>
+    <w:lvl w:ilvl="3" w:tentative="1">
+      <w:start w:val="1"/>
+      <w:numFmt w:val="bullet"/>
+      <w:lvlText w:val=""/>
+      <w:lvlJc w:val="left"/>
+      <w:pPr>
+        <w:tabs>
+          <w:tab w:val="num" w:pos="2880"/>
+        </w:tabs>
+        <w:ind w:left="2880" w:hanging="360"/>
+      </w:pPr>
+      <w:rPr>
+        <w:rFonts w:ascii="Wingdings" w:hAnsi="Wingdings" w:hint="default"/>
+        <w:sz w:val="20"/>
+      </w:rPr>
+    </w:lvl>
+    <w:lvl w:ilvl="4" w:tentative="1">
+      <w:start w:val="1"/>
+      <w:numFmt w:val="bullet"/>
+      <w:lvlText w:val=""/>
+      <w:lvlJc w:val="left"/>
+      <w:pPr>
+        <w:tabs>
+          <w:tab w:val="num" w:pos="3600"/>
+        </w:tabs>
+        <w:ind w:left="3600" w:hanging="360"/>
+      </w:pPr>
+      <w:rPr>
+        <w:rFonts w:ascii="Wingdings" w:hAnsi="Wingdings" w:hint="default"/>
+        <w:sz w:val="20"/>
+      </w:rPr>
+    </w:lvl>
+    <w:lvl w:ilvl="5" w:tentative="1">
+      <w:start w:val="1"/>
+      <w:numFmt w:val="bullet"/>
+      <w:lvlText w:val=""/>
+      <w:lvlJc w:val="left"/>
+      <w:pPr>
+        <w:tabs>
+          <w:tab w:val="num" w:pos="4320"/>
+        </w:tabs>
+        <w:ind w:left="4320" w:hanging="360"/>
+      </w:pPr>
+      <w:rPr>
+        <w:rFonts w:ascii="Wingdings" w:hAnsi="Wingdings" w:hint="default"/>
+        <w:sz w:val="20"/>
+      </w:rPr>
+    </w:lvl>
+    <w:lvl w:ilvl="6" w:tentative="1">
+      <w:start w:val="1"/>
+      <w:numFmt w:val="bullet"/>
+      <w:lvlText w:val=""/>
+      <w:lvlJc w:val="left"/>
+      <w:pPr>
+        <w:tabs>
+          <w:tab w:val="num" w:pos="5040"/>
+        </w:tabs>
+        <w:ind w:left="5040" w:hanging="360"/>
+      </w:pPr>
+      <w:rPr>
+        <w:rFonts w:ascii="Wingdings" w:hAnsi="Wingdings" w:hint="default"/>
+        <w:sz w:val="20"/>
+      </w:rPr>
+    </w:lvl>
+    <w:lvl w:ilvl="7" w:tentative="1">
+      <w:start w:val="1"/>
+      <w:numFmt w:val="bullet"/>
+      <w:lvlText w:val=""/>
+      <w:lvlJc w:val="left"/>
+      <w:pPr>
+        <w:tabs>
+          <w:tab w:val="num" w:pos="5760"/>
+        </w:tabs>
+        <w:ind w:left="5760" w:hanging="360"/>
+      </w:pPr>
+      <w:rPr>
+        <w:rFonts w:ascii="Wingdings" w:hAnsi="Wingdings" w:hint="default"/>
+        <w:sz w:val="20"/>
+      </w:rPr>
+    </w:lvl>
+    <w:lvl w:ilvl="8" w:tentative="1">
+      <w:start w:val="1"/>
+      <w:numFmt w:val="bullet"/>
+      <w:lvlText w:val=""/>
+      <w:lvlJc w:val="left"/>
+      <w:pPr>
+        <w:tabs>
+          <w:tab w:val="num" w:pos="6480"/>
+        </w:tabs>
+        <w:ind w:left="6480" w:hanging="360"/>
+      </w:pPr>
+      <w:rPr>
+        <w:rFonts w:ascii="Wingdings" w:hAnsi="Wingdings" w:hint="default"/>
+        <w:sz w:val="20"/>
+      </w:rPr>
+    </w:lvl>
+  </w:abstractNum>
+  <w:abstractNum w:abstractNumId="5" w15:restartNumberingAfterBreak="0">
+    <w:nsid w:val="5BA80CE0"/>
+    <w:multiLevelType w:val="multilevel"/>
+    <w:tmpl w:val="42C61A0A"/>
+    <w:lvl w:ilvl="0">
+      <w:start w:val="4"/>
+      <w:numFmt w:val="decimal"/>
+      <w:lvlText w:val="%1."/>
+      <w:lvlJc w:val="left"/>
+      <w:pPr>
+        <w:tabs>
+          <w:tab w:val="num" w:pos="720"/>
+        </w:tabs>
+        <w:ind w:left="720" w:hanging="360"/>
+      </w:pPr>
+    </w:lvl>
+    <w:lvl w:ilvl="1" w:tentative="1">
+      <w:start w:val="1"/>
+      <w:numFmt w:val="decimal"/>
+      <w:lvlText w:val="%2."/>
+      <w:lvlJc w:val="left"/>
+      <w:pPr>
+        <w:tabs>
+          <w:tab w:val="num" w:pos="1440"/>
+        </w:tabs>
+        <w:ind w:left="1440" w:hanging="360"/>
+      </w:pPr>
+    </w:lvl>
+    <w:lvl w:ilvl="2" w:tentative="1">
+      <w:start w:val="1"/>
+      <w:numFmt w:val="decimal"/>
+      <w:lvlText w:val="%3."/>
+      <w:lvlJc w:val="left"/>
+      <w:pPr>
+        <w:tabs>
+          <w:tab w:val="num" w:pos="2160"/>
+        </w:tabs>
+        <w:ind w:left="2160" w:hanging="360"/>
+      </w:pPr>
+    </w:lvl>
+    <w:lvl w:ilvl="3" w:tentative="1">
+      <w:start w:val="1"/>
+      <w:numFmt w:val="decimal"/>
+      <w:lvlText w:val="%4."/>
+      <w:lvlJc w:val="left"/>
+      <w:pPr>
+        <w:tabs>
+          <w:tab w:val="num" w:pos="2880"/>
+        </w:tabs>
+        <w:ind w:left="2880" w:hanging="360"/>
+      </w:pPr>
+    </w:lvl>
+    <w:lvl w:ilvl="4" w:tentative="1">
+      <w:start w:val="1"/>
+      <w:numFmt w:val="decimal"/>
+      <w:lvlText w:val="%5."/>
+      <w:lvlJc w:val="left"/>
+      <w:pPr>
+        <w:tabs>
+          <w:tab w:val="num" w:pos="3600"/>
+        </w:tabs>
+        <w:ind w:left="3600" w:hanging="360"/>
+      </w:pPr>
+    </w:lvl>
+    <w:lvl w:ilvl="5" w:tentative="1">
+      <w:start w:val="1"/>
+      <w:numFmt w:val="decimal"/>
+      <w:lvlText w:val="%6."/>
+      <w:lvlJc w:val="left"/>
+      <w:pPr>
+        <w:tabs>
+          <w:tab w:val="num" w:pos="4320"/>
+        </w:tabs>
+        <w:ind w:left="4320" w:hanging="360"/>
+      </w:pPr>
+    </w:lvl>
+    <w:lvl w:ilvl="6" w:tentative="1">
+      <w:start w:val="1"/>
+      <w:numFmt w:val="decimal"/>
+      <w:lvlText w:val="%7."/>
+      <w:lvlJc w:val="left"/>
+      <w:pPr>
+        <w:tabs>
+          <w:tab w:val="num" w:pos="5040"/>
+        </w:tabs>
+        <w:ind w:left="5040" w:hanging="360"/>
+      </w:pPr>
+    </w:lvl>
+    <w:lvl w:ilvl="7" w:tentative="1">
+      <w:start w:val="1"/>
+      <w:numFmt w:val="decimal"/>
+      <w:lvlText w:val="%8."/>
+      <w:lvlJc w:val="left"/>
+      <w:pPr>
+        <w:tabs>
+          <w:tab w:val="num" w:pos="5760"/>
+        </w:tabs>
+        <w:ind w:left="5760" w:hanging="360"/>
+      </w:pPr>
+    </w:lvl>
+    <w:lvl w:ilvl="8" w:tentative="1">
+      <w:start w:val="1"/>
+      <w:numFmt w:val="decimal"/>
+      <w:lvlText w:val="%9."/>
+      <w:lvlJc w:val="left"/>
+      <w:pPr>
+        <w:tabs>
+          <w:tab w:val="num" w:pos="6480"/>
+        </w:tabs>
+        <w:ind w:left="6480" w:hanging="360"/>
+      </w:pPr>
+    </w:lvl>
+  </w:abstractNum>
   <w:num w:numId="1" w16cid:durableId="1533420291">
+    <w:abstractNumId w:val="4"/>
+  </w:num>
+  <w:num w:numId="2" w16cid:durableId="152918560">
+    <w:abstractNumId w:val="1"/>
+  </w:num>
+  <w:num w:numId="3" w16cid:durableId="1539395475">
+    <w:abstractNumId w:val="2"/>
+  </w:num>
+  <w:num w:numId="4" w16cid:durableId="283653775">
     <w:abstractNumId w:val="0"/>
+  </w:num>
+  <w:num w:numId="5" w16cid:durableId="804931166">
+    <w:abstractNumId w:val="5"/>
+  </w:num>
+  <w:num w:numId="6" w16cid:durableId="1495343722">
+    <w:abstractNumId w:val="3"/>
   </w:num>
 </w:numbering>
 </file>

</xml_diff>